<commit_message>
fix: fix model names
</commit_message>
<xml_diff>
--- a/House_Royale_Proje_Raporu.docx
+++ b/House_Royale_Proje_Raporu.docx
@@ -5206,12 +5206,6 @@
         <w:gridCol w:w="9000"/>
       </w:tblGrid>
       <w:tr>
-        <w:tblPrEx>
-          <w:tblCellMar>
-            <w:top w:w="0" w:type="dxa"/>
-            <w:bottom w:w="0" w:type="dxa"/>
-          </w:tblCellMar>
-        </w:tblPrEx>
         <w:trPr>
           <w:trHeight w:val="3400"/>
           <w:jc w:val="center"/>
@@ -5336,12 +5330,6 @@
         <w:gridCol w:w="6000"/>
       </w:tblGrid>
       <w:tr>
-        <w:tblPrEx>
-          <w:tblCellMar>
-            <w:top w:w="0" w:type="dxa"/>
-            <w:bottom w:w="0" w:type="dxa"/>
-          </w:tblCellMar>
-        </w:tblPrEx>
         <w:trPr>
           <w:tblHeader/>
           <w:jc w:val="center"/>
@@ -5414,12 +5402,6 @@
         </w:tc>
       </w:tr>
       <w:tr>
-        <w:tblPrEx>
-          <w:tblCellMar>
-            <w:top w:w="0" w:type="dxa"/>
-            <w:bottom w:w="0" w:type="dxa"/>
-          </w:tblCellMar>
-        </w:tblPrEx>
         <w:trPr>
           <w:jc w:val="center"/>
         </w:trPr>
@@ -5485,12 +5467,6 @@
         </w:tc>
       </w:tr>
       <w:tr>
-        <w:tblPrEx>
-          <w:tblCellMar>
-            <w:top w:w="0" w:type="dxa"/>
-            <w:bottom w:w="0" w:type="dxa"/>
-          </w:tblCellMar>
-        </w:tblPrEx>
         <w:trPr>
           <w:jc w:val="center"/>
         </w:trPr>
@@ -5556,12 +5532,6 @@
         </w:tc>
       </w:tr>
       <w:tr>
-        <w:tblPrEx>
-          <w:tblCellMar>
-            <w:top w:w="0" w:type="dxa"/>
-            <w:bottom w:w="0" w:type="dxa"/>
-          </w:tblCellMar>
-        </w:tblPrEx>
         <w:trPr>
           <w:jc w:val="center"/>
         </w:trPr>
@@ -5627,12 +5597,6 @@
         </w:tc>
       </w:tr>
       <w:tr>
-        <w:tblPrEx>
-          <w:tblCellMar>
-            <w:top w:w="0" w:type="dxa"/>
-            <w:bottom w:w="0" w:type="dxa"/>
-          </w:tblCellMar>
-        </w:tblPrEx>
         <w:trPr>
           <w:jc w:val="center"/>
         </w:trPr>
@@ -5698,12 +5662,6 @@
         </w:tc>
       </w:tr>
       <w:tr>
-        <w:tblPrEx>
-          <w:tblCellMar>
-            <w:top w:w="0" w:type="dxa"/>
-            <w:bottom w:w="0" w:type="dxa"/>
-          </w:tblCellMar>
-        </w:tblPrEx>
         <w:trPr>
           <w:jc w:val="center"/>
         </w:trPr>
@@ -5983,12 +5941,6 @@
         <w:gridCol w:w="3300"/>
       </w:tblGrid>
       <w:tr>
-        <w:tblPrEx>
-          <w:tblCellMar>
-            <w:top w:w="0" w:type="dxa"/>
-            <w:bottom w:w="0" w:type="dxa"/>
-          </w:tblCellMar>
-        </w:tblPrEx>
         <w:trPr>
           <w:tblHeader/>
           <w:jc w:val="center"/>
@@ -6094,12 +6046,6 @@
         </w:tc>
       </w:tr>
       <w:tr>
-        <w:tblPrEx>
-          <w:tblCellMar>
-            <w:top w:w="0" w:type="dxa"/>
-            <w:bottom w:w="0" w:type="dxa"/>
-          </w:tblCellMar>
-        </w:tblPrEx>
         <w:trPr>
           <w:jc w:val="center"/>
         </w:trPr>
@@ -6195,12 +6141,6 @@
         </w:tc>
       </w:tr>
       <w:tr>
-        <w:tblPrEx>
-          <w:tblCellMar>
-            <w:top w:w="0" w:type="dxa"/>
-            <w:bottom w:w="0" w:type="dxa"/>
-          </w:tblCellMar>
-        </w:tblPrEx>
         <w:trPr>
           <w:jc w:val="center"/>
         </w:trPr>
@@ -6310,12 +6250,6 @@
         </w:tc>
       </w:tr>
       <w:tr>
-        <w:tblPrEx>
-          <w:tblCellMar>
-            <w:top w:w="0" w:type="dxa"/>
-            <w:bottom w:w="0" w:type="dxa"/>
-          </w:tblCellMar>
-        </w:tblPrEx>
         <w:trPr>
           <w:jc w:val="center"/>
         </w:trPr>
@@ -6411,12 +6345,6 @@
         </w:tc>
       </w:tr>
       <w:tr>
-        <w:tblPrEx>
-          <w:tblCellMar>
-            <w:top w:w="0" w:type="dxa"/>
-            <w:bottom w:w="0" w:type="dxa"/>
-          </w:tblCellMar>
-        </w:tblPrEx>
         <w:trPr>
           <w:jc w:val="center"/>
         </w:trPr>
@@ -6512,12 +6440,6 @@
         </w:tc>
       </w:tr>
       <w:tr>
-        <w:tblPrEx>
-          <w:tblCellMar>
-            <w:top w:w="0" w:type="dxa"/>
-            <w:bottom w:w="0" w:type="dxa"/>
-          </w:tblCellMar>
-        </w:tblPrEx>
         <w:trPr>
           <w:jc w:val="center"/>
         </w:trPr>
@@ -6821,12 +6743,6 @@
         <w:gridCol w:w="4500"/>
       </w:tblGrid>
       <w:tr>
-        <w:tblPrEx>
-          <w:tblCellMar>
-            <w:top w:w="0" w:type="dxa"/>
-            <w:bottom w:w="0" w:type="dxa"/>
-          </w:tblCellMar>
-        </w:tblPrEx>
         <w:trPr>
           <w:tblHeader/>
           <w:jc w:val="center"/>
@@ -6899,12 +6815,6 @@
         </w:tc>
       </w:tr>
       <w:tr>
-        <w:tblPrEx>
-          <w:tblCellMar>
-            <w:top w:w="0" w:type="dxa"/>
-            <w:bottom w:w="0" w:type="dxa"/>
-          </w:tblCellMar>
-        </w:tblPrEx>
         <w:trPr>
           <w:jc w:val="center"/>
         </w:trPr>
@@ -6970,12 +6880,6 @@
         </w:tc>
       </w:tr>
       <w:tr>
-        <w:tblPrEx>
-          <w:tblCellMar>
-            <w:top w:w="0" w:type="dxa"/>
-            <w:bottom w:w="0" w:type="dxa"/>
-          </w:tblCellMar>
-        </w:tblPrEx>
         <w:trPr>
           <w:jc w:val="center"/>
         </w:trPr>
@@ -7041,12 +6945,6 @@
         </w:tc>
       </w:tr>
       <w:tr>
-        <w:tblPrEx>
-          <w:tblCellMar>
-            <w:top w:w="0" w:type="dxa"/>
-            <w:bottom w:w="0" w:type="dxa"/>
-          </w:tblCellMar>
-        </w:tblPrEx>
         <w:trPr>
           <w:jc w:val="center"/>
         </w:trPr>
@@ -7112,12 +7010,6 @@
         </w:tc>
       </w:tr>
       <w:tr>
-        <w:tblPrEx>
-          <w:tblCellMar>
-            <w:top w:w="0" w:type="dxa"/>
-            <w:bottom w:w="0" w:type="dxa"/>
-          </w:tblCellMar>
-        </w:tblPrEx>
         <w:trPr>
           <w:jc w:val="center"/>
         </w:trPr>
@@ -7183,12 +7075,6 @@
         </w:tc>
       </w:tr>
       <w:tr>
-        <w:tblPrEx>
-          <w:tblCellMar>
-            <w:top w:w="0" w:type="dxa"/>
-            <w:bottom w:w="0" w:type="dxa"/>
-          </w:tblCellMar>
-        </w:tblPrEx>
         <w:trPr>
           <w:jc w:val="center"/>
         </w:trPr>
@@ -7254,12 +7140,6 @@
         </w:tc>
       </w:tr>
       <w:tr>
-        <w:tblPrEx>
-          <w:tblCellMar>
-            <w:top w:w="0" w:type="dxa"/>
-            <w:bottom w:w="0" w:type="dxa"/>
-          </w:tblCellMar>
-        </w:tblPrEx>
         <w:trPr>
           <w:jc w:val="center"/>
         </w:trPr>
@@ -7417,12 +7297,6 @@
         <w:gridCol w:w="3900"/>
       </w:tblGrid>
       <w:tr>
-        <w:tblPrEx>
-          <w:tblCellMar>
-            <w:top w:w="0" w:type="dxa"/>
-            <w:bottom w:w="0" w:type="dxa"/>
-          </w:tblCellMar>
-        </w:tblPrEx>
         <w:trPr>
           <w:tblHeader/>
           <w:jc w:val="center"/>
@@ -7528,12 +7402,6 @@
         </w:tc>
       </w:tr>
       <w:tr>
-        <w:tblPrEx>
-          <w:tblCellMar>
-            <w:top w:w="0" w:type="dxa"/>
-            <w:bottom w:w="0" w:type="dxa"/>
-          </w:tblCellMar>
-        </w:tblPrEx>
         <w:trPr>
           <w:jc w:val="center"/>
         </w:trPr>
@@ -7629,12 +7497,6 @@
         </w:tc>
       </w:tr>
       <w:tr>
-        <w:tblPrEx>
-          <w:tblCellMar>
-            <w:top w:w="0" w:type="dxa"/>
-            <w:bottom w:w="0" w:type="dxa"/>
-          </w:tblCellMar>
-        </w:tblPrEx>
         <w:trPr>
           <w:jc w:val="center"/>
         </w:trPr>
@@ -7730,12 +7592,6 @@
         </w:tc>
       </w:tr>
       <w:tr>
-        <w:tblPrEx>
-          <w:tblCellMar>
-            <w:top w:w="0" w:type="dxa"/>
-            <w:bottom w:w="0" w:type="dxa"/>
-          </w:tblCellMar>
-        </w:tblPrEx>
         <w:trPr>
           <w:jc w:val="center"/>
         </w:trPr>
@@ -7831,12 +7687,6 @@
         </w:tc>
       </w:tr>
       <w:tr>
-        <w:tblPrEx>
-          <w:tblCellMar>
-            <w:top w:w="0" w:type="dxa"/>
-            <w:bottom w:w="0" w:type="dxa"/>
-          </w:tblCellMar>
-        </w:tblPrEx>
         <w:trPr>
           <w:jc w:val="center"/>
         </w:trPr>
@@ -7932,12 +7782,6 @@
         </w:tc>
       </w:tr>
       <w:tr>
-        <w:tblPrEx>
-          <w:tblCellMar>
-            <w:top w:w="0" w:type="dxa"/>
-            <w:bottom w:w="0" w:type="dxa"/>
-          </w:tblCellMar>
-        </w:tblPrEx>
         <w:trPr>
           <w:jc w:val="center"/>
         </w:trPr>
@@ -8040,12 +7884,6 @@
         </w:tc>
       </w:tr>
       <w:tr>
-        <w:tblPrEx>
-          <w:tblCellMar>
-            <w:top w:w="0" w:type="dxa"/>
-            <w:bottom w:w="0" w:type="dxa"/>
-          </w:tblCellMar>
-        </w:tblPrEx>
         <w:trPr>
           <w:jc w:val="center"/>
         </w:trPr>
@@ -8141,12 +7979,6 @@
         </w:tc>
       </w:tr>
       <w:tr>
-        <w:tblPrEx>
-          <w:tblCellMar>
-            <w:top w:w="0" w:type="dxa"/>
-            <w:bottom w:w="0" w:type="dxa"/>
-          </w:tblCellMar>
-        </w:tblPrEx>
         <w:trPr>
           <w:jc w:val="center"/>
         </w:trPr>
@@ -8242,12 +8074,6 @@
         </w:tc>
       </w:tr>
       <w:tr>
-        <w:tblPrEx>
-          <w:tblCellMar>
-            <w:top w:w="0" w:type="dxa"/>
-            <w:bottom w:w="0" w:type="dxa"/>
-          </w:tblCellMar>
-        </w:tblPrEx>
         <w:trPr>
           <w:jc w:val="center"/>
         </w:trPr>
@@ -8343,12 +8169,6 @@
         </w:tc>
       </w:tr>
       <w:tr>
-        <w:tblPrEx>
-          <w:tblCellMar>
-            <w:top w:w="0" w:type="dxa"/>
-            <w:bottom w:w="0" w:type="dxa"/>
-          </w:tblCellMar>
-        </w:tblPrEx>
         <w:trPr>
           <w:jc w:val="center"/>
         </w:trPr>
@@ -8444,12 +8264,6 @@
         </w:tc>
       </w:tr>
       <w:tr>
-        <w:tblPrEx>
-          <w:tblCellMar>
-            <w:top w:w="0" w:type="dxa"/>
-            <w:bottom w:w="0" w:type="dxa"/>
-          </w:tblCellMar>
-        </w:tblPrEx>
         <w:trPr>
           <w:jc w:val="center"/>
         </w:trPr>
@@ -8545,12 +8359,6 @@
         </w:tc>
       </w:tr>
       <w:tr>
-        <w:tblPrEx>
-          <w:tblCellMar>
-            <w:top w:w="0" w:type="dxa"/>
-            <w:bottom w:w="0" w:type="dxa"/>
-          </w:tblCellMar>
-        </w:tblPrEx>
         <w:trPr>
           <w:jc w:val="center"/>
         </w:trPr>
@@ -8646,12 +8454,6 @@
         </w:tc>
       </w:tr>
       <w:tr>
-        <w:tblPrEx>
-          <w:tblCellMar>
-            <w:top w:w="0" w:type="dxa"/>
-            <w:bottom w:w="0" w:type="dxa"/>
-          </w:tblCellMar>
-        </w:tblPrEx>
         <w:trPr>
           <w:jc w:val="center"/>
         </w:trPr>
@@ -8748,12 +8550,6 @@
         </w:tc>
       </w:tr>
       <w:tr>
-        <w:tblPrEx>
-          <w:tblCellMar>
-            <w:top w:w="0" w:type="dxa"/>
-            <w:bottom w:w="0" w:type="dxa"/>
-          </w:tblCellMar>
-        </w:tblPrEx>
         <w:trPr>
           <w:jc w:val="center"/>
         </w:trPr>
@@ -8849,12 +8645,6 @@
         </w:tc>
       </w:tr>
       <w:tr>
-        <w:tblPrEx>
-          <w:tblCellMar>
-            <w:top w:w="0" w:type="dxa"/>
-            <w:bottom w:w="0" w:type="dxa"/>
-          </w:tblCellMar>
-        </w:tblPrEx>
         <w:trPr>
           <w:jc w:val="center"/>
         </w:trPr>
@@ -8950,12 +8740,6 @@
         </w:tc>
       </w:tr>
       <w:tr>
-        <w:tblPrEx>
-          <w:tblCellMar>
-            <w:top w:w="0" w:type="dxa"/>
-            <w:bottom w:w="0" w:type="dxa"/>
-          </w:tblCellMar>
-        </w:tblPrEx>
         <w:trPr>
           <w:jc w:val="center"/>
         </w:trPr>
@@ -9400,14 +9184,7 @@
           <w:b/>
           <w:bCs/>
         </w:rPr>
-        <w:t>ChatGPT Image 2</w:t>
-      </w:r>
-      <w:r>
-        <w:rPr>
-          <w:b/>
-          <w:bCs/>
-        </w:rPr>
-        <w:t xml:space="preserve">: </w:t>
+        <w:t xml:space="preserve">ChatGPT Image 2: </w:t>
       </w:r>
       <w:r>
         <w:t>UI/UX prototipleri için tasarım taslakları (geliştirme öncesi).</w:t>
@@ -9498,12 +9275,6 @@
         <w:gridCol w:w="9000"/>
       </w:tblGrid>
       <w:tr>
-        <w:tblPrEx>
-          <w:tblCellMar>
-            <w:top w:w="0" w:type="dxa"/>
-            <w:bottom w:w="0" w:type="dxa"/>
-          </w:tblCellMar>
-        </w:tblPrEx>
         <w:trPr>
           <w:trHeight w:val="3400"/>
           <w:jc w:val="center"/>
@@ -9619,12 +9390,6 @@
         <w:gridCol w:w="3600"/>
       </w:tblGrid>
       <w:tr>
-        <w:tblPrEx>
-          <w:tblCellMar>
-            <w:top w:w="0" w:type="dxa"/>
-            <w:bottom w:w="0" w:type="dxa"/>
-          </w:tblCellMar>
-        </w:tblPrEx>
         <w:trPr>
           <w:tblHeader/>
           <w:jc w:val="center"/>
@@ -9730,12 +9495,6 @@
         </w:tc>
       </w:tr>
       <w:tr>
-        <w:tblPrEx>
-          <w:tblCellMar>
-            <w:top w:w="0" w:type="dxa"/>
-            <w:bottom w:w="0" w:type="dxa"/>
-          </w:tblCellMar>
-        </w:tblPrEx>
         <w:trPr>
           <w:jc w:val="center"/>
         </w:trPr>
@@ -9831,12 +9590,6 @@
         </w:tc>
       </w:tr>
       <w:tr>
-        <w:tblPrEx>
-          <w:tblCellMar>
-            <w:top w:w="0" w:type="dxa"/>
-            <w:bottom w:w="0" w:type="dxa"/>
-          </w:tblCellMar>
-        </w:tblPrEx>
         <w:trPr>
           <w:jc w:val="center"/>
         </w:trPr>
@@ -9946,12 +9699,6 @@
         </w:tc>
       </w:tr>
       <w:tr>
-        <w:tblPrEx>
-          <w:tblCellMar>
-            <w:top w:w="0" w:type="dxa"/>
-            <w:bottom w:w="0" w:type="dxa"/>
-          </w:tblCellMar>
-        </w:tblPrEx>
         <w:trPr>
           <w:jc w:val="center"/>
         </w:trPr>
@@ -10047,12 +9794,6 @@
         </w:tc>
       </w:tr>
       <w:tr>
-        <w:tblPrEx>
-          <w:tblCellMar>
-            <w:top w:w="0" w:type="dxa"/>
-            <w:bottom w:w="0" w:type="dxa"/>
-          </w:tblCellMar>
-        </w:tblPrEx>
         <w:trPr>
           <w:jc w:val="center"/>
         </w:trPr>
@@ -10148,12 +9889,6 @@
         </w:tc>
       </w:tr>
       <w:tr>
-        <w:tblPrEx>
-          <w:tblCellMar>
-            <w:top w:w="0" w:type="dxa"/>
-            <w:bottom w:w="0" w:type="dxa"/>
-          </w:tblCellMar>
-        </w:tblPrEx>
         <w:trPr>
           <w:jc w:val="center"/>
         </w:trPr>
@@ -10249,12 +9984,6 @@
         </w:tc>
       </w:tr>
       <w:tr>
-        <w:tblPrEx>
-          <w:tblCellMar>
-            <w:top w:w="0" w:type="dxa"/>
-            <w:bottom w:w="0" w:type="dxa"/>
-          </w:tblCellMar>
-        </w:tblPrEx>
         <w:trPr>
           <w:jc w:val="center"/>
         </w:trPr>
@@ -10410,12 +10139,6 @@
         <w:gridCol w:w="9000"/>
       </w:tblGrid>
       <w:tr>
-        <w:tblPrEx>
-          <w:tblCellMar>
-            <w:top w:w="0" w:type="dxa"/>
-            <w:bottom w:w="0" w:type="dxa"/>
-          </w:tblCellMar>
-        </w:tblPrEx>
         <w:trPr>
           <w:jc w:val="center"/>
         </w:trPr>
@@ -10907,6 +10630,7 @@
           <w:sz w:val="22"/>
           <w:szCs w:val="22"/>
         </w:rPr>
+        <w:lastRenderedPageBreak/>
         <w:t>Şekil 3.2. Monorepo klasör yapısı (sadeleştirilmiş)</w:t>
       </w:r>
     </w:p>
@@ -10987,12 +10711,6 @@
         <w:gridCol w:w="2700"/>
       </w:tblGrid>
       <w:tr>
-        <w:tblPrEx>
-          <w:tblCellMar>
-            <w:top w:w="0" w:type="dxa"/>
-            <w:bottom w:w="0" w:type="dxa"/>
-          </w:tblCellMar>
-        </w:tblPrEx>
         <w:trPr>
           <w:tblHeader/>
           <w:jc w:val="center"/>
@@ -11098,12 +10816,6 @@
         </w:tc>
       </w:tr>
       <w:tr>
-        <w:tblPrEx>
-          <w:tblCellMar>
-            <w:top w:w="0" w:type="dxa"/>
-            <w:bottom w:w="0" w:type="dxa"/>
-          </w:tblCellMar>
-        </w:tblPrEx>
         <w:trPr>
           <w:jc w:val="center"/>
         </w:trPr>
@@ -11199,12 +10911,6 @@
         </w:tc>
       </w:tr>
       <w:tr>
-        <w:tblPrEx>
-          <w:tblCellMar>
-            <w:top w:w="0" w:type="dxa"/>
-            <w:bottom w:w="0" w:type="dxa"/>
-          </w:tblCellMar>
-        </w:tblPrEx>
         <w:trPr>
           <w:jc w:val="center"/>
         </w:trPr>
@@ -11300,12 +11006,6 @@
         </w:tc>
       </w:tr>
       <w:tr>
-        <w:tblPrEx>
-          <w:tblCellMar>
-            <w:top w:w="0" w:type="dxa"/>
-            <w:bottom w:w="0" w:type="dxa"/>
-          </w:tblCellMar>
-        </w:tblPrEx>
         <w:trPr>
           <w:jc w:val="center"/>
         </w:trPr>
@@ -11401,12 +11101,6 @@
         </w:tc>
       </w:tr>
       <w:tr>
-        <w:tblPrEx>
-          <w:tblCellMar>
-            <w:top w:w="0" w:type="dxa"/>
-            <w:bottom w:w="0" w:type="dxa"/>
-          </w:tblCellMar>
-        </w:tblPrEx>
         <w:trPr>
           <w:jc w:val="center"/>
         </w:trPr>
@@ -11553,12 +11247,6 @@
         <w:gridCol w:w="4000"/>
       </w:tblGrid>
       <w:tr>
-        <w:tblPrEx>
-          <w:tblCellMar>
-            <w:top w:w="0" w:type="dxa"/>
-            <w:bottom w:w="0" w:type="dxa"/>
-          </w:tblCellMar>
-        </w:tblPrEx>
         <w:trPr>
           <w:tblHeader/>
           <w:jc w:val="center"/>
@@ -11697,12 +11385,6 @@
         </w:tc>
       </w:tr>
       <w:tr>
-        <w:tblPrEx>
-          <w:tblCellMar>
-            <w:top w:w="0" w:type="dxa"/>
-            <w:bottom w:w="0" w:type="dxa"/>
-          </w:tblCellMar>
-        </w:tblPrEx>
         <w:trPr>
           <w:jc w:val="center"/>
         </w:trPr>
@@ -11828,12 +11510,6 @@
         </w:tc>
       </w:tr>
       <w:tr>
-        <w:tblPrEx>
-          <w:tblCellMar>
-            <w:top w:w="0" w:type="dxa"/>
-            <w:bottom w:w="0" w:type="dxa"/>
-          </w:tblCellMar>
-        </w:tblPrEx>
         <w:trPr>
           <w:jc w:val="center"/>
         </w:trPr>
@@ -11959,12 +11635,6 @@
         </w:tc>
       </w:tr>
       <w:tr>
-        <w:tblPrEx>
-          <w:tblCellMar>
-            <w:top w:w="0" w:type="dxa"/>
-            <w:bottom w:w="0" w:type="dxa"/>
-          </w:tblCellMar>
-        </w:tblPrEx>
         <w:trPr>
           <w:jc w:val="center"/>
         </w:trPr>
@@ -12090,12 +11760,6 @@
         </w:tc>
       </w:tr>
       <w:tr>
-        <w:tblPrEx>
-          <w:tblCellMar>
-            <w:top w:w="0" w:type="dxa"/>
-            <w:bottom w:w="0" w:type="dxa"/>
-          </w:tblCellMar>
-        </w:tblPrEx>
         <w:trPr>
           <w:jc w:val="center"/>
         </w:trPr>
@@ -12221,12 +11885,6 @@
         </w:tc>
       </w:tr>
       <w:tr>
-        <w:tblPrEx>
-          <w:tblCellMar>
-            <w:top w:w="0" w:type="dxa"/>
-            <w:bottom w:w="0" w:type="dxa"/>
-          </w:tblCellMar>
-        </w:tblPrEx>
         <w:trPr>
           <w:jc w:val="center"/>
         </w:trPr>
@@ -12352,12 +12010,6 @@
         </w:tc>
       </w:tr>
       <w:tr>
-        <w:tblPrEx>
-          <w:tblCellMar>
-            <w:top w:w="0" w:type="dxa"/>
-            <w:bottom w:w="0" w:type="dxa"/>
-          </w:tblCellMar>
-        </w:tblPrEx>
         <w:trPr>
           <w:jc w:val="center"/>
         </w:trPr>
@@ -12547,12 +12199,6 @@
         <w:gridCol w:w="9000"/>
       </w:tblGrid>
       <w:tr>
-        <w:tblPrEx>
-          <w:tblCellMar>
-            <w:top w:w="0" w:type="dxa"/>
-            <w:bottom w:w="0" w:type="dxa"/>
-          </w:tblCellMar>
-        </w:tblPrEx>
         <w:trPr>
           <w:trHeight w:val="2400"/>
           <w:jc w:val="center"/>
@@ -12652,12 +12298,6 @@
         <w:gridCol w:w="9000"/>
       </w:tblGrid>
       <w:tr>
-        <w:tblPrEx>
-          <w:tblCellMar>
-            <w:top w:w="0" w:type="dxa"/>
-            <w:bottom w:w="0" w:type="dxa"/>
-          </w:tblCellMar>
-        </w:tblPrEx>
         <w:trPr>
           <w:trHeight w:val="2400"/>
           <w:jc w:val="center"/>
@@ -12772,12 +12412,6 @@
         <w:gridCol w:w="6500"/>
       </w:tblGrid>
       <w:tr>
-        <w:tblPrEx>
-          <w:tblCellMar>
-            <w:top w:w="0" w:type="dxa"/>
-            <w:bottom w:w="0" w:type="dxa"/>
-          </w:tblCellMar>
-        </w:tblPrEx>
         <w:trPr>
           <w:tblHeader/>
           <w:jc w:val="center"/>
@@ -12850,12 +12484,6 @@
         </w:tc>
       </w:tr>
       <w:tr>
-        <w:tblPrEx>
-          <w:tblCellMar>
-            <w:top w:w="0" w:type="dxa"/>
-            <w:bottom w:w="0" w:type="dxa"/>
-          </w:tblCellMar>
-        </w:tblPrEx>
         <w:trPr>
           <w:jc w:val="center"/>
         </w:trPr>
@@ -12921,12 +12549,6 @@
         </w:tc>
       </w:tr>
       <w:tr>
-        <w:tblPrEx>
-          <w:tblCellMar>
-            <w:top w:w="0" w:type="dxa"/>
-            <w:bottom w:w="0" w:type="dxa"/>
-          </w:tblCellMar>
-        </w:tblPrEx>
         <w:trPr>
           <w:jc w:val="center"/>
         </w:trPr>
@@ -12992,12 +12614,6 @@
         </w:tc>
       </w:tr>
       <w:tr>
-        <w:tblPrEx>
-          <w:tblCellMar>
-            <w:top w:w="0" w:type="dxa"/>
-            <w:bottom w:w="0" w:type="dxa"/>
-          </w:tblCellMar>
-        </w:tblPrEx>
         <w:trPr>
           <w:jc w:val="center"/>
         </w:trPr>
@@ -13063,12 +12679,6 @@
         </w:tc>
       </w:tr>
       <w:tr>
-        <w:tblPrEx>
-          <w:tblCellMar>
-            <w:top w:w="0" w:type="dxa"/>
-            <w:bottom w:w="0" w:type="dxa"/>
-          </w:tblCellMar>
-        </w:tblPrEx>
         <w:trPr>
           <w:jc w:val="center"/>
         </w:trPr>
@@ -13134,12 +12744,6 @@
         </w:tc>
       </w:tr>
       <w:tr>
-        <w:tblPrEx>
-          <w:tblCellMar>
-            <w:top w:w="0" w:type="dxa"/>
-            <w:bottom w:w="0" w:type="dxa"/>
-          </w:tblCellMar>
-        </w:tblPrEx>
         <w:trPr>
           <w:jc w:val="center"/>
         </w:trPr>
@@ -13205,12 +12809,6 @@
         </w:tc>
       </w:tr>
       <w:tr>
-        <w:tblPrEx>
-          <w:tblCellMar>
-            <w:top w:w="0" w:type="dxa"/>
-            <w:bottom w:w="0" w:type="dxa"/>
-          </w:tblCellMar>
-        </w:tblPrEx>
         <w:trPr>
           <w:jc w:val="center"/>
         </w:trPr>
@@ -13276,12 +12874,6 @@
         </w:tc>
       </w:tr>
       <w:tr>
-        <w:tblPrEx>
-          <w:tblCellMar>
-            <w:top w:w="0" w:type="dxa"/>
-            <w:bottom w:w="0" w:type="dxa"/>
-          </w:tblCellMar>
-        </w:tblPrEx>
         <w:trPr>
           <w:jc w:val="center"/>
         </w:trPr>
@@ -13347,12 +12939,6 @@
         </w:tc>
       </w:tr>
       <w:tr>
-        <w:tblPrEx>
-          <w:tblCellMar>
-            <w:top w:w="0" w:type="dxa"/>
-            <w:bottom w:w="0" w:type="dxa"/>
-          </w:tblCellMar>
-        </w:tblPrEx>
         <w:trPr>
           <w:jc w:val="center"/>
         </w:trPr>
@@ -13451,12 +13037,6 @@
         <w:gridCol w:w="9000"/>
       </w:tblGrid>
       <w:tr>
-        <w:tblPrEx>
-          <w:tblCellMar>
-            <w:top w:w="0" w:type="dxa"/>
-            <w:bottom w:w="0" w:type="dxa"/>
-          </w:tblCellMar>
-        </w:tblPrEx>
         <w:trPr>
           <w:trHeight w:val="2400"/>
           <w:jc w:val="center"/>
@@ -13534,12 +13114,6 @@
         <w:gridCol w:w="9000"/>
       </w:tblGrid>
       <w:tr>
-        <w:tblPrEx>
-          <w:tblCellMar>
-            <w:top w:w="0" w:type="dxa"/>
-            <w:bottom w:w="0" w:type="dxa"/>
-          </w:tblCellMar>
-        </w:tblPrEx>
         <w:trPr>
           <w:trHeight w:val="2400"/>
           <w:jc w:val="center"/>
@@ -13617,12 +13191,6 @@
         <w:gridCol w:w="9000"/>
       </w:tblGrid>
       <w:tr>
-        <w:tblPrEx>
-          <w:tblCellMar>
-            <w:top w:w="0" w:type="dxa"/>
-            <w:bottom w:w="0" w:type="dxa"/>
-          </w:tblCellMar>
-        </w:tblPrEx>
         <w:trPr>
           <w:trHeight w:val="2400"/>
           <w:jc w:val="center"/>
@@ -13700,12 +13268,6 @@
         <w:gridCol w:w="9000"/>
       </w:tblGrid>
       <w:tr>
-        <w:tblPrEx>
-          <w:tblCellMar>
-            <w:top w:w="0" w:type="dxa"/>
-            <w:bottom w:w="0" w:type="dxa"/>
-          </w:tblCellMar>
-        </w:tblPrEx>
         <w:trPr>
           <w:trHeight w:val="2400"/>
           <w:jc w:val="center"/>
@@ -13794,12 +13356,6 @@
         <w:gridCol w:w="9000"/>
       </w:tblGrid>
       <w:tr>
-        <w:tblPrEx>
-          <w:tblCellMar>
-            <w:top w:w="0" w:type="dxa"/>
-            <w:bottom w:w="0" w:type="dxa"/>
-          </w:tblCellMar>
-        </w:tblPrEx>
         <w:trPr>
           <w:trHeight w:val="2400"/>
           <w:jc w:val="center"/>
@@ -13926,12 +13482,6 @@
         <w:gridCol w:w="1300"/>
       </w:tblGrid>
       <w:tr>
-        <w:tblPrEx>
-          <w:tblCellMar>
-            <w:top w:w="0" w:type="dxa"/>
-            <w:bottom w:w="0" w:type="dxa"/>
-          </w:tblCellMar>
-        </w:tblPrEx>
         <w:trPr>
           <w:tblHeader/>
           <w:jc w:val="center"/>
@@ -14071,12 +13621,6 @@
         </w:tc>
       </w:tr>
       <w:tr>
-        <w:tblPrEx>
-          <w:tblCellMar>
-            <w:top w:w="0" w:type="dxa"/>
-            <w:bottom w:w="0" w:type="dxa"/>
-          </w:tblCellMar>
-        </w:tblPrEx>
         <w:trPr>
           <w:jc w:val="center"/>
         </w:trPr>
@@ -14202,12 +13746,6 @@
         </w:tc>
       </w:tr>
       <w:tr>
-        <w:tblPrEx>
-          <w:tblCellMar>
-            <w:top w:w="0" w:type="dxa"/>
-            <w:bottom w:w="0" w:type="dxa"/>
-          </w:tblCellMar>
-        </w:tblPrEx>
         <w:trPr>
           <w:jc w:val="center"/>
         </w:trPr>
@@ -14267,7 +13805,21 @@
                 <w:sz w:val="22"/>
                 <w:szCs w:val="22"/>
               </w:rPr>
-              <w:t>model_1 MLP Pro · model_2 MLP Plus</w:t>
+              <w:t>model_1</w:t>
+            </w:r>
+            <w:r>
+              <w:rPr>
+                <w:sz w:val="22"/>
+                <w:szCs w:val="22"/>
+              </w:rPr>
+              <w:t xml:space="preserve"> /</w:t>
+            </w:r>
+            <w:r>
+              <w:rPr>
+                <w:sz w:val="22"/>
+                <w:szCs w:val="22"/>
+              </w:rPr>
+              <w:t xml:space="preserve"> model_2</w:t>
             </w:r>
           </w:p>
         </w:tc>
@@ -14333,12 +13885,6 @@
         </w:tc>
       </w:tr>
       <w:tr>
-        <w:tblPrEx>
-          <w:tblCellMar>
-            <w:top w:w="0" w:type="dxa"/>
-            <w:bottom w:w="0" w:type="dxa"/>
-          </w:tblCellMar>
-        </w:tblPrEx>
         <w:trPr>
           <w:jc w:val="center"/>
         </w:trPr>
@@ -14464,12 +14010,6 @@
         </w:tc>
       </w:tr>
       <w:tr>
-        <w:tblPrEx>
-          <w:tblCellMar>
-            <w:top w:w="0" w:type="dxa"/>
-            <w:bottom w:w="0" w:type="dxa"/>
-          </w:tblCellMar>
-        </w:tblPrEx>
         <w:trPr>
           <w:jc w:val="center"/>
         </w:trPr>
@@ -14638,12 +14178,6 @@
         <w:gridCol w:w="9000"/>
       </w:tblGrid>
       <w:tr>
-        <w:tblPrEx>
-          <w:tblCellMar>
-            <w:top w:w="0" w:type="dxa"/>
-            <w:bottom w:w="0" w:type="dxa"/>
-          </w:tblCellMar>
-        </w:tblPrEx>
         <w:trPr>
           <w:trHeight w:val="3400"/>
           <w:jc w:val="center"/>
@@ -14717,11 +14251,7 @@
         <w:jc w:val="both"/>
       </w:pPr>
       <w:r>
-        <w:t xml:space="preserve">Elmas ligin model_1 (MLP Pro) ve model_2 (MLP Plus) modelleri, residual bağlantı içermeyen ancak 8 adet ardışık Dense katmandan oluşan derin bir MLP mimarisi kullanır. model_0 ResNet ile aynı ligde yer almalarına karşın, bu modeller farklı bir mimari tercihini </w:t>
-      </w:r>
-      <w:r>
-        <w:lastRenderedPageBreak/>
-        <w:t>temsil eder: aynı verinin tam bağlantılı ama derin bir yapıyla ne kadar öğrenilebileceğini göstermek.</w:t>
+        <w:t>Elmas ligin model_1 ve model_2 modelleri, residual bağlantı içermeyen ancak 8 adet ardışık Dense katmandan oluşan derin bir MLP mimarisi kullanır. model_0 ResNet ile aynı ligde yer almalarına karşın, bu modeller farklı bir mimari tercihini temsil eder: aynı verinin tam bağlantılı ama derin bir yapıyla ne kadar öğrenilebileceğini göstermek.</w:t>
       </w:r>
     </w:p>
     <w:p>
@@ -14735,6 +14265,7 @@
           <w:b/>
           <w:bCs/>
         </w:rPr>
+        <w:lastRenderedPageBreak/>
         <w:t xml:space="preserve">Mimari Özet — model_1 / model_2: </w:t>
       </w:r>
       <w:r>
@@ -14763,12 +14294,6 @@
         <w:gridCol w:w="9000"/>
       </w:tblGrid>
       <w:tr>
-        <w:tblPrEx>
-          <w:tblCellMar>
-            <w:top w:w="0" w:type="dxa"/>
-            <w:bottom w:w="0" w:type="dxa"/>
-          </w:tblCellMar>
-        </w:tblPrEx>
         <w:trPr>
           <w:jc w:val="center"/>
         </w:trPr>
@@ -15069,11 +14594,7 @@
         <w:t>Karar Gerekçesi — Neden bilerek zayıf modeller eğitildi?</w:t>
       </w:r>
       <w:r>
-        <w:t xml:space="preserve"> Klasik bir makine öğrenmesi projesi yalnızca "en iyi" modeli arar. Ancak House Royale'in oyunlaştırma ekseni, oyuncuların yenebileceği rakiplerle de karşılaşmasını gerektirir. Yeni başlayan bir kullanıcının daima Elmas seviyesi modellerle (model_0 ResNet ya da model_1/2 8-</w:t>
-      </w:r>
-      <w:r>
-        <w:lastRenderedPageBreak/>
-        <w:t>katmanlı MLP) yarışması demotivasyondur. Bronz lig modelleri 4-2 nöronluk Dense katmanlarıyla bilinçli olarak zayıflaştırılmıştır.</w:t>
+        <w:t xml:space="preserve"> Klasik bir makine öğrenmesi projesi yalnızca "en iyi" modeli arar. Ancak House Royale'in oyunlaştırma ekseni, oyuncuların yenebileceği rakiplerle de karşılaşmasını gerektirir. Yeni başlayan bir kullanıcının daima Elmas seviyesi modellerle (model_0 ResNet ya da model_1/2 8-katmanlı MLP) yarışması demotivasyondur. Bronz lig modelleri 4-2 nöronluk Dense katmanlarıyla bilinçli olarak zayıflaştırılmıştır.</w:t>
       </w:r>
     </w:p>
     <w:p>
@@ -15162,12 +14683,6 @@
         <w:gridCol w:w="9000"/>
       </w:tblGrid>
       <w:tr>
-        <w:tblPrEx>
-          <w:tblCellMar>
-            <w:top w:w="0" w:type="dxa"/>
-            <w:bottom w:w="0" w:type="dxa"/>
-          </w:tblCellMar>
-        </w:tblPrEx>
         <w:trPr>
           <w:jc w:val="center"/>
         </w:trPr>
@@ -15360,12 +14875,6 @@
         </w:tc>
       </w:tr>
       <w:tr>
-        <w:tblPrEx>
-          <w:tblCellMar>
-            <w:top w:w="0" w:type="dxa"/>
-            <w:bottom w:w="0" w:type="dxa"/>
-          </w:tblCellMar>
-        </w:tblPrEx>
         <w:trPr>
           <w:trHeight w:val="2400"/>
           <w:jc w:val="center"/>
@@ -15465,12 +14974,6 @@
         <w:gridCol w:w="9000"/>
       </w:tblGrid>
       <w:tr>
-        <w:tblPrEx>
-          <w:tblCellMar>
-            <w:top w:w="0" w:type="dxa"/>
-            <w:bottom w:w="0" w:type="dxa"/>
-          </w:tblCellMar>
-        </w:tblPrEx>
         <w:trPr>
           <w:jc w:val="center"/>
         </w:trPr>
@@ -15844,12 +15347,6 @@
         <w:gridCol w:w="3000"/>
       </w:tblGrid>
       <w:tr>
-        <w:tblPrEx>
-          <w:tblCellMar>
-            <w:top w:w="0" w:type="dxa"/>
-            <w:bottom w:w="0" w:type="dxa"/>
-          </w:tblCellMar>
-        </w:tblPrEx>
         <w:trPr>
           <w:tblHeader/>
           <w:jc w:val="center"/>
@@ -15955,12 +15452,6 @@
         </w:tc>
       </w:tr>
       <w:tr>
-        <w:tblPrEx>
-          <w:tblCellMar>
-            <w:top w:w="0" w:type="dxa"/>
-            <w:bottom w:w="0" w:type="dxa"/>
-          </w:tblCellMar>
-        </w:tblPrEx>
         <w:trPr>
           <w:jc w:val="center"/>
         </w:trPr>
@@ -16056,12 +15547,6 @@
         </w:tc>
       </w:tr>
       <w:tr>
-        <w:tblPrEx>
-          <w:tblCellMar>
-            <w:top w:w="0" w:type="dxa"/>
-            <w:bottom w:w="0" w:type="dxa"/>
-          </w:tblCellMar>
-        </w:tblPrEx>
         <w:trPr>
           <w:jc w:val="center"/>
         </w:trPr>
@@ -16157,12 +15642,6 @@
         </w:tc>
       </w:tr>
       <w:tr>
-        <w:tblPrEx>
-          <w:tblCellMar>
-            <w:top w:w="0" w:type="dxa"/>
-            <w:bottom w:w="0" w:type="dxa"/>
-          </w:tblCellMar>
-        </w:tblPrEx>
         <w:trPr>
           <w:jc w:val="center"/>
         </w:trPr>
@@ -16259,12 +15738,6 @@
         </w:tc>
       </w:tr>
       <w:tr>
-        <w:tblPrEx>
-          <w:tblCellMar>
-            <w:top w:w="0" w:type="dxa"/>
-            <w:bottom w:w="0" w:type="dxa"/>
-          </w:tblCellMar>
-        </w:tblPrEx>
         <w:trPr>
           <w:jc w:val="center"/>
         </w:trPr>
@@ -16424,12 +15897,6 @@
         <w:gridCol w:w="9000"/>
       </w:tblGrid>
       <w:tr>
-        <w:tblPrEx>
-          <w:tblCellMar>
-            <w:top w:w="0" w:type="dxa"/>
-            <w:bottom w:w="0" w:type="dxa"/>
-          </w:tblCellMar>
-        </w:tblPrEx>
         <w:trPr>
           <w:trHeight w:val="2400"/>
           <w:jc w:val="center"/>
@@ -16570,12 +16037,6 @@
         <w:gridCol w:w="3000"/>
       </w:tblGrid>
       <w:tr>
-        <w:tblPrEx>
-          <w:tblCellMar>
-            <w:top w:w="0" w:type="dxa"/>
-            <w:bottom w:w="0" w:type="dxa"/>
-          </w:tblCellMar>
-        </w:tblPrEx>
         <w:trPr>
           <w:tblHeader/>
           <w:jc w:val="center"/>
@@ -16681,12 +16142,6 @@
         </w:tc>
       </w:tr>
       <w:tr>
-        <w:tblPrEx>
-          <w:tblCellMar>
-            <w:top w:w="0" w:type="dxa"/>
-            <w:bottom w:w="0" w:type="dxa"/>
-          </w:tblCellMar>
-        </w:tblPrEx>
         <w:trPr>
           <w:jc w:val="center"/>
         </w:trPr>
@@ -16782,12 +16237,6 @@
         </w:tc>
       </w:tr>
       <w:tr>
-        <w:tblPrEx>
-          <w:tblCellMar>
-            <w:top w:w="0" w:type="dxa"/>
-            <w:bottom w:w="0" w:type="dxa"/>
-          </w:tblCellMar>
-        </w:tblPrEx>
         <w:trPr>
           <w:jc w:val="center"/>
         </w:trPr>
@@ -16883,12 +16332,6 @@
         </w:tc>
       </w:tr>
       <w:tr>
-        <w:tblPrEx>
-          <w:tblCellMar>
-            <w:top w:w="0" w:type="dxa"/>
-            <w:bottom w:w="0" w:type="dxa"/>
-          </w:tblCellMar>
-        </w:tblPrEx>
         <w:trPr>
           <w:jc w:val="center"/>
         </w:trPr>
@@ -16984,12 +16427,6 @@
         </w:tc>
       </w:tr>
       <w:tr>
-        <w:tblPrEx>
-          <w:tblCellMar>
-            <w:top w:w="0" w:type="dxa"/>
-            <w:bottom w:w="0" w:type="dxa"/>
-          </w:tblCellMar>
-        </w:tblPrEx>
         <w:trPr>
           <w:jc w:val="center"/>
         </w:trPr>
@@ -17085,12 +16522,6 @@
         </w:tc>
       </w:tr>
       <w:tr>
-        <w:tblPrEx>
-          <w:tblCellMar>
-            <w:top w:w="0" w:type="dxa"/>
-            <w:bottom w:w="0" w:type="dxa"/>
-          </w:tblCellMar>
-        </w:tblPrEx>
         <w:trPr>
           <w:jc w:val="center"/>
         </w:trPr>
@@ -17229,12 +16660,6 @@
         <w:gridCol w:w="9000"/>
       </w:tblGrid>
       <w:tr>
-        <w:tblPrEx>
-          <w:tblCellMar>
-            <w:top w:w="0" w:type="dxa"/>
-            <w:bottom w:w="0" w:type="dxa"/>
-          </w:tblCellMar>
-        </w:tblPrEx>
         <w:trPr>
           <w:jc w:val="center"/>
         </w:trPr>
@@ -17410,12 +16835,6 @@
         <w:gridCol w:w="9000"/>
       </w:tblGrid>
       <w:tr>
-        <w:tblPrEx>
-          <w:tblCellMar>
-            <w:top w:w="0" w:type="dxa"/>
-            <w:bottom w:w="0" w:type="dxa"/>
-          </w:tblCellMar>
-        </w:tblPrEx>
         <w:trPr>
           <w:jc w:val="center"/>
         </w:trPr>
@@ -17573,12 +16992,6 @@
         <w:gridCol w:w="9000"/>
       </w:tblGrid>
       <w:tr>
-        <w:tblPrEx>
-          <w:tblCellMar>
-            <w:top w:w="0" w:type="dxa"/>
-            <w:bottom w:w="0" w:type="dxa"/>
-          </w:tblCellMar>
-        </w:tblPrEx>
         <w:trPr>
           <w:jc w:val="center"/>
         </w:trPr>
@@ -17953,12 +17366,6 @@
         </w:tc>
       </w:tr>
       <w:tr>
-        <w:tblPrEx>
-          <w:tblCellMar>
-            <w:top w:w="0" w:type="dxa"/>
-            <w:bottom w:w="0" w:type="dxa"/>
-          </w:tblCellMar>
-        </w:tblPrEx>
         <w:trPr>
           <w:trHeight w:val="2400"/>
           <w:jc w:val="center"/>
@@ -18069,12 +17476,6 @@
         <w:gridCol w:w="9000"/>
       </w:tblGrid>
       <w:tr>
-        <w:tblPrEx>
-          <w:tblCellMar>
-            <w:top w:w="0" w:type="dxa"/>
-            <w:bottom w:w="0" w:type="dxa"/>
-          </w:tblCellMar>
-        </w:tblPrEx>
         <w:trPr>
           <w:jc w:val="center"/>
         </w:trPr>
@@ -18327,12 +17728,6 @@
         <w:gridCol w:w="9000"/>
       </w:tblGrid>
       <w:tr>
-        <w:tblPrEx>
-          <w:tblCellMar>
-            <w:top w:w="0" w:type="dxa"/>
-            <w:bottom w:w="0" w:type="dxa"/>
-          </w:tblCellMar>
-        </w:tblPrEx>
         <w:trPr>
           <w:jc w:val="center"/>
         </w:trPr>
@@ -18712,12 +18107,6 @@
         <w:gridCol w:w="9000"/>
       </w:tblGrid>
       <w:tr>
-        <w:tblPrEx>
-          <w:tblCellMar>
-            <w:top w:w="0" w:type="dxa"/>
-            <w:bottom w:w="0" w:type="dxa"/>
-          </w:tblCellMar>
-        </w:tblPrEx>
         <w:trPr>
           <w:jc w:val="center"/>
         </w:trPr>
@@ -18938,12 +18327,6 @@
         <w:gridCol w:w="9000"/>
       </w:tblGrid>
       <w:tr>
-        <w:tblPrEx>
-          <w:tblCellMar>
-            <w:top w:w="0" w:type="dxa"/>
-            <w:bottom w:w="0" w:type="dxa"/>
-          </w:tblCellMar>
-        </w:tblPrEx>
         <w:trPr>
           <w:jc w:val="center"/>
         </w:trPr>
@@ -19414,12 +18797,6 @@
         <w:gridCol w:w="9000"/>
       </w:tblGrid>
       <w:tr>
-        <w:tblPrEx>
-          <w:tblCellMar>
-            <w:top w:w="0" w:type="dxa"/>
-            <w:bottom w:w="0" w:type="dxa"/>
-          </w:tblCellMar>
-        </w:tblPrEx>
         <w:trPr>
           <w:jc w:val="center"/>
         </w:trPr>
@@ -19630,12 +19007,6 @@
         <w:gridCol w:w="9000"/>
       </w:tblGrid>
       <w:tr>
-        <w:tblPrEx>
-          <w:tblCellMar>
-            <w:top w:w="0" w:type="dxa"/>
-            <w:bottom w:w="0" w:type="dxa"/>
-          </w:tblCellMar>
-        </w:tblPrEx>
         <w:trPr>
           <w:jc w:val="center"/>
         </w:trPr>
@@ -20092,12 +19463,6 @@
         <w:gridCol w:w="9000"/>
       </w:tblGrid>
       <w:tr>
-        <w:tblPrEx>
-          <w:tblCellMar>
-            <w:top w:w="0" w:type="dxa"/>
-            <w:bottom w:w="0" w:type="dxa"/>
-          </w:tblCellMar>
-        </w:tblPrEx>
         <w:trPr>
           <w:jc w:val="center"/>
         </w:trPr>
@@ -20389,6 +19754,7 @@
         <w:jc w:val="both"/>
       </w:pPr>
       <w:r>
+        <w:lastRenderedPageBreak/>
         <w:t>LP terfi/tenzil eşikleri Çizelge 4.3'te gösterilmektedir.</w:t>
       </w:r>
     </w:p>
@@ -20431,12 +19797,6 @@
         <w:gridCol w:w="4000"/>
       </w:tblGrid>
       <w:tr>
-        <w:tblPrEx>
-          <w:tblCellMar>
-            <w:top w:w="0" w:type="dxa"/>
-            <w:bottom w:w="0" w:type="dxa"/>
-          </w:tblCellMar>
-        </w:tblPrEx>
         <w:trPr>
           <w:tblHeader/>
           <w:jc w:val="center"/>
@@ -20542,12 +19902,6 @@
         </w:tc>
       </w:tr>
       <w:tr>
-        <w:tblPrEx>
-          <w:tblCellMar>
-            <w:top w:w="0" w:type="dxa"/>
-            <w:bottom w:w="0" w:type="dxa"/>
-          </w:tblCellMar>
-        </w:tblPrEx>
         <w:trPr>
           <w:jc w:val="center"/>
         </w:trPr>
@@ -20643,12 +19997,6 @@
         </w:tc>
       </w:tr>
       <w:tr>
-        <w:tblPrEx>
-          <w:tblCellMar>
-            <w:top w:w="0" w:type="dxa"/>
-            <w:bottom w:w="0" w:type="dxa"/>
-          </w:tblCellMar>
-        </w:tblPrEx>
         <w:trPr>
           <w:jc w:val="center"/>
         </w:trPr>
@@ -20744,12 +20092,6 @@
         </w:tc>
       </w:tr>
       <w:tr>
-        <w:tblPrEx>
-          <w:tblCellMar>
-            <w:top w:w="0" w:type="dxa"/>
-            <w:bottom w:w="0" w:type="dxa"/>
-          </w:tblCellMar>
-        </w:tblPrEx>
         <w:trPr>
           <w:jc w:val="center"/>
         </w:trPr>
@@ -20845,12 +20187,6 @@
         </w:tc>
       </w:tr>
       <w:tr>
-        <w:tblPrEx>
-          <w:tblCellMar>
-            <w:top w:w="0" w:type="dxa"/>
-            <w:bottom w:w="0" w:type="dxa"/>
-          </w:tblCellMar>
-        </w:tblPrEx>
         <w:trPr>
           <w:jc w:val="center"/>
         </w:trPr>
@@ -21000,12 +20336,6 @@
         <w:gridCol w:w="9000"/>
       </w:tblGrid>
       <w:tr>
-        <w:tblPrEx>
-          <w:tblCellMar>
-            <w:top w:w="0" w:type="dxa"/>
-            <w:bottom w:w="0" w:type="dxa"/>
-          </w:tblCellMar>
-        </w:tblPrEx>
         <w:trPr>
           <w:jc w:val="center"/>
         </w:trPr>
@@ -21284,6 +20614,7 @@
       </w:pPr>
       <w:bookmarkStart w:id="58" w:name="_Toc230644310"/>
       <w:r>
+        <w:lastRenderedPageBreak/>
         <w:t>4.5.2. useWebSocket Hook'u — Otomatik Yeniden Bağlanma</w:t>
       </w:r>
       <w:bookmarkEnd w:id="58"/>
@@ -21320,12 +20651,6 @@
         <w:gridCol w:w="9000"/>
       </w:tblGrid>
       <w:tr>
-        <w:tblPrEx>
-          <w:tblCellMar>
-            <w:top w:w="0" w:type="dxa"/>
-            <w:bottom w:w="0" w:type="dxa"/>
-          </w:tblCellMar>
-        </w:tblPrEx>
         <w:trPr>
           <w:jc w:val="center"/>
         </w:trPr>
@@ -21496,12 +20821,6 @@
         <w:gridCol w:w="9000"/>
       </w:tblGrid>
       <w:tr>
-        <w:tblPrEx>
-          <w:tblCellMar>
-            <w:top w:w="0" w:type="dxa"/>
-            <w:bottom w:w="0" w:type="dxa"/>
-          </w:tblCellMar>
-        </w:tblPrEx>
         <w:trPr>
           <w:trHeight w:val="2400"/>
           <w:jc w:val="center"/>
@@ -21714,12 +21033,6 @@
         <w:gridCol w:w="9000"/>
       </w:tblGrid>
       <w:tr>
-        <w:tblPrEx>
-          <w:tblCellMar>
-            <w:top w:w="0" w:type="dxa"/>
-            <w:bottom w:w="0" w:type="dxa"/>
-          </w:tblCellMar>
-        </w:tblPrEx>
         <w:trPr>
           <w:jc w:val="center"/>
         </w:trPr>
@@ -21801,12 +21114,6 @@
         <w:gridCol w:w="9000"/>
       </w:tblGrid>
       <w:tr>
-        <w:tblPrEx>
-          <w:tblCellMar>
-            <w:top w:w="0" w:type="dxa"/>
-            <w:bottom w:w="0" w:type="dxa"/>
-          </w:tblCellMar>
-        </w:tblPrEx>
         <w:trPr>
           <w:jc w:val="center"/>
         </w:trPr>
@@ -21914,12 +21221,6 @@
         <w:gridCol w:w="9000"/>
       </w:tblGrid>
       <w:tr>
-        <w:tblPrEx>
-          <w:tblCellMar>
-            <w:top w:w="0" w:type="dxa"/>
-            <w:bottom w:w="0" w:type="dxa"/>
-          </w:tblCellMar>
-        </w:tblPrEx>
         <w:trPr>
           <w:jc w:val="center"/>
         </w:trPr>
@@ -22027,12 +21328,6 @@
         <w:gridCol w:w="9000"/>
       </w:tblGrid>
       <w:tr>
-        <w:tblPrEx>
-          <w:tblCellMar>
-            <w:top w:w="0" w:type="dxa"/>
-            <w:bottom w:w="0" w:type="dxa"/>
-          </w:tblCellMar>
-        </w:tblPrEx>
         <w:trPr>
           <w:jc w:val="center"/>
         </w:trPr>
@@ -22101,12 +21396,6 @@
         <w:gridCol w:w="9000"/>
       </w:tblGrid>
       <w:tr>
-        <w:tblPrEx>
-          <w:tblCellMar>
-            <w:top w:w="0" w:type="dxa"/>
-            <w:bottom w:w="0" w:type="dxa"/>
-          </w:tblCellMar>
-        </w:tblPrEx>
         <w:trPr>
           <w:jc w:val="center"/>
         </w:trPr>
@@ -22282,12 +21571,6 @@
         <w:gridCol w:w="9000"/>
       </w:tblGrid>
       <w:tr>
-        <w:tblPrEx>
-          <w:tblCellMar>
-            <w:top w:w="0" w:type="dxa"/>
-            <w:bottom w:w="0" w:type="dxa"/>
-          </w:tblCellMar>
-        </w:tblPrEx>
         <w:trPr>
           <w:jc w:val="center"/>
         </w:trPr>
@@ -22464,12 +21747,6 @@
         <w:gridCol w:w="4800"/>
       </w:tblGrid>
       <w:tr>
-        <w:tblPrEx>
-          <w:tblCellMar>
-            <w:top w:w="0" w:type="dxa"/>
-            <w:bottom w:w="0" w:type="dxa"/>
-          </w:tblCellMar>
-        </w:tblPrEx>
         <w:trPr>
           <w:tblHeader/>
           <w:jc w:val="center"/>
@@ -22575,12 +21852,6 @@
         </w:tc>
       </w:tr>
       <w:tr>
-        <w:tblPrEx>
-          <w:tblCellMar>
-            <w:top w:w="0" w:type="dxa"/>
-            <w:bottom w:w="0" w:type="dxa"/>
-          </w:tblCellMar>
-        </w:tblPrEx>
         <w:trPr>
           <w:jc w:val="center"/>
         </w:trPr>
@@ -22676,12 +21947,6 @@
         </w:tc>
       </w:tr>
       <w:tr>
-        <w:tblPrEx>
-          <w:tblCellMar>
-            <w:top w:w="0" w:type="dxa"/>
-            <w:bottom w:w="0" w:type="dxa"/>
-          </w:tblCellMar>
-        </w:tblPrEx>
         <w:trPr>
           <w:jc w:val="center"/>
         </w:trPr>
@@ -22777,12 +22042,6 @@
         </w:tc>
       </w:tr>
       <w:tr>
-        <w:tblPrEx>
-          <w:tblCellMar>
-            <w:top w:w="0" w:type="dxa"/>
-            <w:bottom w:w="0" w:type="dxa"/>
-          </w:tblCellMar>
-        </w:tblPrEx>
         <w:trPr>
           <w:jc w:val="center"/>
         </w:trPr>
@@ -22878,12 +22137,6 @@
         </w:tc>
       </w:tr>
       <w:tr>
-        <w:tblPrEx>
-          <w:tblCellMar>
-            <w:top w:w="0" w:type="dxa"/>
-            <w:bottom w:w="0" w:type="dxa"/>
-          </w:tblCellMar>
-        </w:tblPrEx>
         <w:trPr>
           <w:jc w:val="center"/>
         </w:trPr>
@@ -23059,12 +22312,6 @@
         <w:gridCol w:w="1255"/>
       </w:tblGrid>
       <w:tr>
-        <w:tblPrEx>
-          <w:tblCellMar>
-            <w:top w:w="0" w:type="dxa"/>
-            <w:bottom w:w="0" w:type="dxa"/>
-          </w:tblCellMar>
-        </w:tblPrEx>
         <w:trPr>
           <w:tblHeader/>
           <w:jc w:val="center"/>
@@ -23236,12 +22483,6 @@
         </w:tc>
       </w:tr>
       <w:tr>
-        <w:tblPrEx>
-          <w:tblCellMar>
-            <w:top w:w="0" w:type="dxa"/>
-            <w:bottom w:w="0" w:type="dxa"/>
-          </w:tblCellMar>
-        </w:tblPrEx>
         <w:trPr>
           <w:jc w:val="center"/>
         </w:trPr>
@@ -23397,12 +22638,6 @@
         </w:tc>
       </w:tr>
       <w:tr>
-        <w:tblPrEx>
-          <w:tblCellMar>
-            <w:top w:w="0" w:type="dxa"/>
-            <w:bottom w:w="0" w:type="dxa"/>
-          </w:tblCellMar>
-        </w:tblPrEx>
         <w:trPr>
           <w:jc w:val="center"/>
         </w:trPr>
@@ -23434,6 +22669,13 @@
               </w:rPr>
               <w:t>model_1 MLP Pro</w:t>
             </w:r>
+            <w:r>
+              <w:rPr>
+                <w:sz w:val="22"/>
+                <w:szCs w:val="22"/>
+              </w:rPr>
+              <w:t xml:space="preserve"> Plus Max</w:t>
+            </w:r>
           </w:p>
         </w:tc>
         <w:tc>
@@ -23558,12 +22800,6 @@
         </w:tc>
       </w:tr>
       <w:tr>
-        <w:tblPrEx>
-          <w:tblCellMar>
-            <w:top w:w="0" w:type="dxa"/>
-            <w:bottom w:w="0" w:type="dxa"/>
-          </w:tblCellMar>
-        </w:tblPrEx>
         <w:trPr>
           <w:jc w:val="center"/>
         </w:trPr>
@@ -23593,7 +22829,14 @@
                 <w:sz w:val="22"/>
                 <w:szCs w:val="22"/>
               </w:rPr>
-              <w:t>model_2 MLP Plus</w:t>
+              <w:t>model_2 MLP P</w:t>
+            </w:r>
+            <w:r>
+              <w:rPr>
+                <w:sz w:val="22"/>
+                <w:szCs w:val="22"/>
+              </w:rPr>
+              <w:t>ro Plus</w:t>
             </w:r>
           </w:p>
         </w:tc>
@@ -23719,12 +22962,6 @@
         </w:tc>
       </w:tr>
       <w:tr>
-        <w:tblPrEx>
-          <w:tblCellMar>
-            <w:top w:w="0" w:type="dxa"/>
-            <w:bottom w:w="0" w:type="dxa"/>
-          </w:tblCellMar>
-        </w:tblPrEx>
         <w:trPr>
           <w:jc w:val="center"/>
         </w:trPr>
@@ -23880,12 +23117,6 @@
         </w:tc>
       </w:tr>
       <w:tr>
-        <w:tblPrEx>
-          <w:tblCellMar>
-            <w:top w:w="0" w:type="dxa"/>
-            <w:bottom w:w="0" w:type="dxa"/>
-          </w:tblCellMar>
-        </w:tblPrEx>
         <w:trPr>
           <w:jc w:val="center"/>
         </w:trPr>
@@ -24041,12 +23272,6 @@
         </w:tc>
       </w:tr>
       <w:tr>
-        <w:tblPrEx>
-          <w:tblCellMar>
-            <w:top w:w="0" w:type="dxa"/>
-            <w:bottom w:w="0" w:type="dxa"/>
-          </w:tblCellMar>
-        </w:tblPrEx>
         <w:trPr>
           <w:jc w:val="center"/>
         </w:trPr>
@@ -24202,12 +23427,6 @@
         </w:tc>
       </w:tr>
       <w:tr>
-        <w:tblPrEx>
-          <w:tblCellMar>
-            <w:top w:w="0" w:type="dxa"/>
-            <w:bottom w:w="0" w:type="dxa"/>
-          </w:tblCellMar>
-        </w:tblPrEx>
         <w:trPr>
           <w:jc w:val="center"/>
         </w:trPr>
@@ -24363,12 +23582,6 @@
         </w:tc>
       </w:tr>
       <w:tr>
-        <w:tblPrEx>
-          <w:tblCellMar>
-            <w:top w:w="0" w:type="dxa"/>
-            <w:bottom w:w="0" w:type="dxa"/>
-          </w:tblCellMar>
-        </w:tblPrEx>
         <w:trPr>
           <w:jc w:val="center"/>
         </w:trPr>
@@ -24524,12 +23737,6 @@
         </w:tc>
       </w:tr>
       <w:tr>
-        <w:tblPrEx>
-          <w:tblCellMar>
-            <w:top w:w="0" w:type="dxa"/>
-            <w:bottom w:w="0" w:type="dxa"/>
-          </w:tblCellMar>
-        </w:tblPrEx>
         <w:trPr>
           <w:jc w:val="center"/>
         </w:trPr>
@@ -24717,12 +23924,6 @@
         <w:gridCol w:w="9000"/>
       </w:tblGrid>
       <w:tr>
-        <w:tblPrEx>
-          <w:tblCellMar>
-            <w:top w:w="0" w:type="dxa"/>
-            <w:bottom w:w="0" w:type="dxa"/>
-          </w:tblCellMar>
-        </w:tblPrEx>
         <w:trPr>
           <w:trHeight w:val="2400"/>
           <w:jc w:val="center"/>
@@ -24801,12 +24002,6 @@
         <w:gridCol w:w="9000"/>
       </w:tblGrid>
       <w:tr>
-        <w:tblPrEx>
-          <w:tblCellMar>
-            <w:top w:w="0" w:type="dxa"/>
-            <w:bottom w:w="0" w:type="dxa"/>
-          </w:tblCellMar>
-        </w:tblPrEx>
         <w:trPr>
           <w:trHeight w:val="2400"/>
           <w:jc w:val="center"/>
@@ -24931,12 +24126,6 @@
         <w:gridCol w:w="5800"/>
       </w:tblGrid>
       <w:tr>
-        <w:tblPrEx>
-          <w:tblCellMar>
-            <w:top w:w="0" w:type="dxa"/>
-            <w:bottom w:w="0" w:type="dxa"/>
-          </w:tblCellMar>
-        </w:tblPrEx>
         <w:trPr>
           <w:tblHeader/>
           <w:jc w:val="center"/>
@@ -25009,12 +24198,6 @@
         </w:tc>
       </w:tr>
       <w:tr>
-        <w:tblPrEx>
-          <w:tblCellMar>
-            <w:top w:w="0" w:type="dxa"/>
-            <w:bottom w:w="0" w:type="dxa"/>
-          </w:tblCellMar>
-        </w:tblPrEx>
         <w:trPr>
           <w:jc w:val="center"/>
         </w:trPr>
@@ -25101,12 +24284,6 @@
         </w:tc>
       </w:tr>
       <w:tr>
-        <w:tblPrEx>
-          <w:tblCellMar>
-            <w:top w:w="0" w:type="dxa"/>
-            <w:bottom w:w="0" w:type="dxa"/>
-          </w:tblCellMar>
-        </w:tblPrEx>
         <w:trPr>
           <w:jc w:val="center"/>
         </w:trPr>
@@ -25172,12 +24349,6 @@
         </w:tc>
       </w:tr>
       <w:tr>
-        <w:tblPrEx>
-          <w:tblCellMar>
-            <w:top w:w="0" w:type="dxa"/>
-            <w:bottom w:w="0" w:type="dxa"/>
-          </w:tblCellMar>
-        </w:tblPrEx>
         <w:trPr>
           <w:jc w:val="center"/>
         </w:trPr>
@@ -25243,12 +24414,6 @@
         </w:tc>
       </w:tr>
       <w:tr>
-        <w:tblPrEx>
-          <w:tblCellMar>
-            <w:top w:w="0" w:type="dxa"/>
-            <w:bottom w:w="0" w:type="dxa"/>
-          </w:tblCellMar>
-        </w:tblPrEx>
         <w:trPr>
           <w:jc w:val="center"/>
         </w:trPr>
@@ -25329,12 +24494,6 @@
         </w:tc>
       </w:tr>
       <w:tr>
-        <w:tblPrEx>
-          <w:tblCellMar>
-            <w:top w:w="0" w:type="dxa"/>
-            <w:bottom w:w="0" w:type="dxa"/>
-          </w:tblCellMar>
-        </w:tblPrEx>
         <w:trPr>
           <w:jc w:val="center"/>
         </w:trPr>
@@ -25435,12 +24594,6 @@
         </w:tc>
       </w:tr>
       <w:tr>
-        <w:tblPrEx>
-          <w:tblCellMar>
-            <w:top w:w="0" w:type="dxa"/>
-            <w:bottom w:w="0" w:type="dxa"/>
-          </w:tblCellMar>
-        </w:tblPrEx>
         <w:trPr>
           <w:jc w:val="center"/>
         </w:trPr>
@@ -25541,12 +24694,6 @@
         </w:tc>
       </w:tr>
       <w:tr>
-        <w:tblPrEx>
-          <w:tblCellMar>
-            <w:top w:w="0" w:type="dxa"/>
-            <w:bottom w:w="0" w:type="dxa"/>
-          </w:tblCellMar>
-        </w:tblPrEx>
         <w:trPr>
           <w:jc w:val="center"/>
         </w:trPr>
@@ -25647,12 +24794,6 @@
         </w:tc>
       </w:tr>
       <w:tr>
-        <w:tblPrEx>
-          <w:tblCellMar>
-            <w:top w:w="0" w:type="dxa"/>
-            <w:bottom w:w="0" w:type="dxa"/>
-          </w:tblCellMar>
-        </w:tblPrEx>
         <w:trPr>
           <w:jc w:val="center"/>
         </w:trPr>
@@ -25924,12 +25065,6 @@
         <w:gridCol w:w="3200"/>
       </w:tblGrid>
       <w:tr>
-        <w:tblPrEx>
-          <w:tblCellMar>
-            <w:top w:w="0" w:type="dxa"/>
-            <w:bottom w:w="0" w:type="dxa"/>
-          </w:tblCellMar>
-        </w:tblPrEx>
         <w:trPr>
           <w:tblHeader/>
           <w:jc w:val="center"/>
@@ -26035,12 +25170,6 @@
         </w:tc>
       </w:tr>
       <w:tr>
-        <w:tblPrEx>
-          <w:tblCellMar>
-            <w:top w:w="0" w:type="dxa"/>
-            <w:bottom w:w="0" w:type="dxa"/>
-          </w:tblCellMar>
-        </w:tblPrEx>
         <w:trPr>
           <w:jc w:val="center"/>
         </w:trPr>
@@ -26136,12 +25265,6 @@
         </w:tc>
       </w:tr>
       <w:tr>
-        <w:tblPrEx>
-          <w:tblCellMar>
-            <w:top w:w="0" w:type="dxa"/>
-            <w:bottom w:w="0" w:type="dxa"/>
-          </w:tblCellMar>
-        </w:tblPrEx>
         <w:trPr>
           <w:jc w:val="center"/>
         </w:trPr>
@@ -26237,12 +25360,6 @@
         </w:tc>
       </w:tr>
       <w:tr>
-        <w:tblPrEx>
-          <w:tblCellMar>
-            <w:top w:w="0" w:type="dxa"/>
-            <w:bottom w:w="0" w:type="dxa"/>
-          </w:tblCellMar>
-        </w:tblPrEx>
         <w:trPr>
           <w:jc w:val="center"/>
         </w:trPr>
@@ -26338,12 +25455,6 @@
         </w:tc>
       </w:tr>
       <w:tr>
-        <w:tblPrEx>
-          <w:tblCellMar>
-            <w:top w:w="0" w:type="dxa"/>
-            <w:bottom w:w="0" w:type="dxa"/>
-          </w:tblCellMar>
-        </w:tblPrEx>
         <w:trPr>
           <w:jc w:val="center"/>
         </w:trPr>
@@ -26439,12 +25550,6 @@
         </w:tc>
       </w:tr>
       <w:tr>
-        <w:tblPrEx>
-          <w:tblCellMar>
-            <w:top w:w="0" w:type="dxa"/>
-            <w:bottom w:w="0" w:type="dxa"/>
-          </w:tblCellMar>
-        </w:tblPrEx>
         <w:trPr>
           <w:jc w:val="center"/>
         </w:trPr>
@@ -26540,12 +25645,6 @@
         </w:tc>
       </w:tr>
       <w:tr>
-        <w:tblPrEx>
-          <w:tblCellMar>
-            <w:top w:w="0" w:type="dxa"/>
-            <w:bottom w:w="0" w:type="dxa"/>
-          </w:tblCellMar>
-        </w:tblPrEx>
         <w:trPr>
           <w:jc w:val="center"/>
         </w:trPr>
@@ -26772,12 +25871,6 @@
         <w:gridCol w:w="2200"/>
       </w:tblGrid>
       <w:tr>
-        <w:tblPrEx>
-          <w:tblCellMar>
-            <w:top w:w="0" w:type="dxa"/>
-            <w:bottom w:w="0" w:type="dxa"/>
-          </w:tblCellMar>
-        </w:tblPrEx>
         <w:trPr>
           <w:tblHeader/>
           <w:jc w:val="center"/>
@@ -26883,12 +25976,6 @@
         </w:tc>
       </w:tr>
       <w:tr>
-        <w:tblPrEx>
-          <w:tblCellMar>
-            <w:top w:w="0" w:type="dxa"/>
-            <w:bottom w:w="0" w:type="dxa"/>
-          </w:tblCellMar>
-        </w:tblPrEx>
         <w:trPr>
           <w:jc w:val="center"/>
         </w:trPr>
@@ -26984,12 +26071,6 @@
         </w:tc>
       </w:tr>
       <w:tr>
-        <w:tblPrEx>
-          <w:tblCellMar>
-            <w:top w:w="0" w:type="dxa"/>
-            <w:bottom w:w="0" w:type="dxa"/>
-          </w:tblCellMar>
-        </w:tblPrEx>
         <w:trPr>
           <w:jc w:val="center"/>
         </w:trPr>
@@ -27085,12 +26166,6 @@
         </w:tc>
       </w:tr>
       <w:tr>
-        <w:tblPrEx>
-          <w:tblCellMar>
-            <w:top w:w="0" w:type="dxa"/>
-            <w:bottom w:w="0" w:type="dxa"/>
-          </w:tblCellMar>
-        </w:tblPrEx>
         <w:trPr>
           <w:jc w:val="center"/>
         </w:trPr>
@@ -27186,12 +26261,6 @@
         </w:tc>
       </w:tr>
       <w:tr>
-        <w:tblPrEx>
-          <w:tblCellMar>
-            <w:top w:w="0" w:type="dxa"/>
-            <w:bottom w:w="0" w:type="dxa"/>
-          </w:tblCellMar>
-        </w:tblPrEx>
         <w:trPr>
           <w:jc w:val="center"/>
         </w:trPr>
@@ -27287,12 +26356,6 @@
         </w:tc>
       </w:tr>
       <w:tr>
-        <w:tblPrEx>
-          <w:tblCellMar>
-            <w:top w:w="0" w:type="dxa"/>
-            <w:bottom w:w="0" w:type="dxa"/>
-          </w:tblCellMar>
-        </w:tblPrEx>
         <w:trPr>
           <w:jc w:val="center"/>
         </w:trPr>
@@ -27388,12 +26451,6 @@
         </w:tc>
       </w:tr>
       <w:tr>
-        <w:tblPrEx>
-          <w:tblCellMar>
-            <w:top w:w="0" w:type="dxa"/>
-            <w:bottom w:w="0" w:type="dxa"/>
-          </w:tblCellMar>
-        </w:tblPrEx>
         <w:trPr>
           <w:jc w:val="center"/>
         </w:trPr>
@@ -27490,12 +26547,6 @@
         </w:tc>
       </w:tr>
       <w:tr>
-        <w:tblPrEx>
-          <w:tblCellMar>
-            <w:top w:w="0" w:type="dxa"/>
-            <w:bottom w:w="0" w:type="dxa"/>
-          </w:tblCellMar>
-        </w:tblPrEx>
         <w:trPr>
           <w:jc w:val="center"/>
         </w:trPr>
@@ -27591,12 +26642,6 @@
         </w:tc>
       </w:tr>
       <w:tr>
-        <w:tblPrEx>
-          <w:tblCellMar>
-            <w:top w:w="0" w:type="dxa"/>
-            <w:bottom w:w="0" w:type="dxa"/>
-          </w:tblCellMar>
-        </w:tblPrEx>
         <w:trPr>
           <w:jc w:val="center"/>
         </w:trPr>
@@ -29054,6 +28099,7 @@
   <w:style w:type="character" w:default="1" w:styleId="DefaultParagraphFont">
     <w:name w:val="Default Paragraph Font"/>
     <w:uiPriority w:val="1"/>
+    <w:semiHidden/>
     <w:unhideWhenUsed/>
   </w:style>
   <w:style w:type="table" w:default="1" w:styleId="TableNormal">

</xml_diff>